<commit_message>
Fix resume contact line wrapping to two lines
</commit_message>
<xml_diff>
--- a/assets/Shah_Faisal_Resume.docx
+++ b/assets/Shah_Faisal_Resume.docx
@@ -41,7 +41,7 @@
         <w:r>
           <w:rPr>
             <w:color w:val="1F4E5F"/>
-            <w:sz w:val="19"/>
+            <w:sz w:val="17"/>
             <w:u w:val="single"/>
           </w:rPr>
           <w:t>+92 321 7032390</w:t>
@@ -50,15 +50,15 @@
       <w:r>
         <w:rPr>
           <w:color w:val="404040"/>
-          <w:sz w:val="19"/>
+          <w:sz w:val="17"/>
         </w:rPr>
-        <w:t xml:space="preserve">  |  </w:t>
+        <w:t xml:space="preserve"> | </w:t>
       </w:r>
       <w:hyperlink r:id="rId7">
         <w:r>
           <w:rPr>
             <w:color w:val="1F4E5F"/>
-            <w:sz w:val="19"/>
+            <w:sz w:val="17"/>
             <w:u w:val="single"/>
           </w:rPr>
           <w:t>shahfaisalgfg@gmail.com</w:t>
@@ -67,15 +67,15 @@
       <w:r>
         <w:rPr>
           <w:color w:val="404040"/>
-          <w:sz w:val="19"/>
+          <w:sz w:val="17"/>
         </w:rPr>
-        <w:t xml:space="preserve">  |  </w:t>
+        <w:t xml:space="preserve"> | </w:t>
       </w:r>
       <w:hyperlink r:id="rId8">
         <w:r>
           <w:rPr>
             <w:color w:val="1F4E5F"/>
-            <w:sz w:val="19"/>
+            <w:sz w:val="17"/>
             <w:u w:val="single"/>
           </w:rPr>
           <w:t>linkedin.com/in/shah-faisal-gfg</w:t>
@@ -84,15 +84,15 @@
       <w:r>
         <w:rPr>
           <w:color w:val="404040"/>
-          <w:sz w:val="19"/>
+          <w:sz w:val="17"/>
         </w:rPr>
-        <w:t xml:space="preserve">  |  </w:t>
+        <w:t xml:space="preserve"> | </w:t>
       </w:r>
       <w:hyperlink r:id="rId9">
         <w:r>
           <w:rPr>
             <w:color w:val="1F4E5F"/>
-            <w:sz w:val="19"/>
+            <w:sz w:val="17"/>
             <w:u w:val="single"/>
           </w:rPr>
           <w:t>github.com/ShahFaisalGfG</w:t>
@@ -101,15 +101,15 @@
       <w:r>
         <w:rPr>
           <w:color w:val="404040"/>
-          <w:sz w:val="19"/>
+          <w:sz w:val="17"/>
         </w:rPr>
-        <w:t xml:space="preserve">  |  </w:t>
+        <w:t xml:space="preserve"> | </w:t>
       </w:r>
       <w:hyperlink r:id="rId10">
         <w:r>
           <w:rPr>
             <w:color w:val="1F4E5F"/>
-            <w:sz w:val="19"/>
+            <w:sz w:val="17"/>
             <w:u w:val="single"/>
           </w:rPr>
           <w:t>shahfaisalgfg.github.io</w:t>
@@ -945,31 +945,31 @@
       </w:rPr>
     </w:lvl>
   </w:abstractNum>
-  <w:num w:numId="1" w16cid:durableId="468865392">
+  <w:num w:numId="1" w16cid:durableId="213854777">
     <w:abstractNumId w:val="8"/>
   </w:num>
-  <w:num w:numId="2" w16cid:durableId="1042904607">
+  <w:num w:numId="2" w16cid:durableId="1807507951">
     <w:abstractNumId w:val="6"/>
   </w:num>
-  <w:num w:numId="3" w16cid:durableId="746464536">
+  <w:num w:numId="3" w16cid:durableId="1716657285">
     <w:abstractNumId w:val="5"/>
   </w:num>
-  <w:num w:numId="4" w16cid:durableId="914441310">
+  <w:num w:numId="4" w16cid:durableId="360859628">
     <w:abstractNumId w:val="4"/>
   </w:num>
-  <w:num w:numId="5" w16cid:durableId="1323509884">
+  <w:num w:numId="5" w16cid:durableId="1133407602">
     <w:abstractNumId w:val="7"/>
   </w:num>
-  <w:num w:numId="6" w16cid:durableId="21325316">
+  <w:num w:numId="6" w16cid:durableId="1237663703">
     <w:abstractNumId w:val="3"/>
   </w:num>
-  <w:num w:numId="7" w16cid:durableId="2019038638">
+  <w:num w:numId="7" w16cid:durableId="1059355681">
     <w:abstractNumId w:val="2"/>
   </w:num>
-  <w:num w:numId="8" w16cid:durableId="2084598509">
+  <w:num w:numId="8" w16cid:durableId="2109693996">
     <w:abstractNumId w:val="1"/>
   </w:num>
-  <w:num w:numId="9" w16cid:durableId="1260794773">
+  <w:num w:numId="9" w16cid:durableId="1568955684">
     <w:abstractNumId w:val="0"/>
   </w:num>
 </w:numbering>

</xml_diff>